<commit_message>
adding github link and dataflow desciption
</commit_message>
<xml_diff>
--- a/project_milestone_1-5.docx
+++ b/project_milestone_1-5.docx
@@ -848,8 +848,6 @@
           <w:szCs w:val="28"/>
         </w:rPr>
       </w:pPr>
-      <w:bookmarkStart w:id="0" w:name="_GoBack"/>
-      <w:bookmarkEnd w:id="0"/>
     </w:p>
     <w:p>
       <w:pPr>
@@ -3214,7 +3212,7 @@
     <w:p>
       <w:r>
         <w:pict w14:anchorId="36223FE2">
-          <v:rect id="_x0000_i1029" style="width:0;height:1.5pt" o:hralign="center" o:hrstd="t" o:hr="t" fillcolor="#a0a0a0" stroked="f"/>
+          <v:rect id="_x0000_i1027" style="width:0;height:1.5pt" o:hralign="center" o:hrstd="t" o:hr="t" fillcolor="#a0a0a0" stroked="f"/>
         </w:pict>
       </w:r>
     </w:p>
@@ -3635,7 +3633,7 @@
     <w:p>
       <w:r>
         <w:pict w14:anchorId="5AF994B8">
-          <v:rect id="_x0000_i1030" style="width:0;height:1.5pt" o:hralign="center" o:hrstd="t" o:hr="t" fillcolor="#a0a0a0" stroked="f"/>
+          <v:rect id="_x0000_i1028" style="width:0;height:1.5pt" o:hralign="center" o:hrstd="t" o:hr="t" fillcolor="#a0a0a0" stroked="f"/>
         </w:pict>
       </w:r>
     </w:p>
@@ -4235,7 +4233,7 @@
     <w:p>
       <w:r>
         <w:pict w14:anchorId="33CB4BF5">
-          <v:rect id="_x0000_i1031" style="width:0;height:1.5pt" o:hralign="center" o:hrstd="t" o:hr="t" fillcolor="#a0a0a0" stroked="f"/>
+          <v:rect id="_x0000_i1029" style="width:0;height:1.5pt" o:hralign="center" o:hrstd="t" o:hr="t" fillcolor="#a0a0a0" stroked="f"/>
         </w:pict>
       </w:r>
     </w:p>
@@ -4768,7 +4766,7 @@
     <w:p>
       <w:r>
         <w:pict w14:anchorId="192DCC2D">
-          <v:rect id="_x0000_i1032" style="width:0;height:1.5pt" o:hralign="center" o:hrstd="t" o:hr="t" fillcolor="#a0a0a0" stroked="f"/>
+          <v:rect id="_x0000_i1030" style="width:0;height:1.5pt" o:hralign="center" o:hrstd="t" o:hr="t" fillcolor="#a0a0a0" stroked="f"/>
         </w:pict>
       </w:r>
     </w:p>
@@ -4802,6 +4800,519 @@
       <w:r>
         <w:t>. The schema was designed with normalization principles in mind from the beginning, ensuring data integrity, minimal redundancy, and efficient storage. No decomposition or restructuring is required.</w:t>
       </w:r>
+    </w:p>
+    <w:p>
+      <w:pPr>
+        <w:pStyle w:val="font-claude-response-body"/>
+      </w:pPr>
+    </w:p>
+    <w:p>
+      <w:pPr>
+        <w:pStyle w:val="font-claude-response-body"/>
+      </w:pPr>
+    </w:p>
+    <w:p>
+      <w:pPr>
+        <w:pStyle w:val="Heading1"/>
+      </w:pPr>
+      <w:r>
+        <w:lastRenderedPageBreak/>
+        <w:t>Data Flow Description</w:t>
+      </w:r>
+    </w:p>
+    <w:p>
+      <w:pPr>
+        <w:pStyle w:val="NormalWeb"/>
+      </w:pPr>
+      <w:r>
+        <w:t>The Judicial Case Management System follows a structured flow of data between four main entities: Admin, Judge, Case, and Hearing. The system ensures that all records are connected through relational constraints and logical business rules.</w:t>
+      </w:r>
+    </w:p>
+    <w:p>
+      <w:pPr>
+        <w:pStyle w:val="Heading2"/>
+      </w:pPr>
+      <w:r>
+        <w:t>1. Admin Data Flow</w:t>
+      </w:r>
+    </w:p>
+    <w:p>
+      <w:pPr>
+        <w:pStyle w:val="NormalWeb"/>
+      </w:pPr>
+      <w:r>
+        <w:t>The process begins with the creation of Admin records. Admins are responsible for managing the system and performing administrative operations. Each admin can:</w:t>
+      </w:r>
+    </w:p>
+    <w:p>
+      <w:pPr>
+        <w:numPr>
+          <w:ilvl w:val="0"/>
+          <w:numId w:val="19"/>
+        </w:numPr>
+        <w:spacing w:before="100" w:beforeAutospacing="1" w:after="100" w:afterAutospacing="1" w:line="240" w:lineRule="auto"/>
+      </w:pPr>
+      <w:r>
+        <w:t xml:space="preserve">Register judges </w:t>
+      </w:r>
+    </w:p>
+    <w:p>
+      <w:pPr>
+        <w:numPr>
+          <w:ilvl w:val="0"/>
+          <w:numId w:val="19"/>
+        </w:numPr>
+        <w:spacing w:before="100" w:beforeAutospacing="1" w:after="100" w:afterAutospacing="1" w:line="240" w:lineRule="auto"/>
+      </w:pPr>
+      <w:r>
+        <w:t xml:space="preserve">Create and manage cases </w:t>
+      </w:r>
+    </w:p>
+    <w:p>
+      <w:pPr>
+        <w:numPr>
+          <w:ilvl w:val="0"/>
+          <w:numId w:val="19"/>
+        </w:numPr>
+        <w:spacing w:before="100" w:beforeAutospacing="1" w:after="100" w:afterAutospacing="1" w:line="240" w:lineRule="auto"/>
+      </w:pPr>
+      <w:r>
+        <w:t xml:space="preserve">Schedule hearings </w:t>
+      </w:r>
+    </w:p>
+    <w:p>
+      <w:pPr>
+        <w:pStyle w:val="NormalWeb"/>
+      </w:pPr>
+      <w:r>
+        <w:t xml:space="preserve">Admin information is stored in the </w:t>
+      </w:r>
+      <w:r>
+        <w:rPr>
+          <w:rStyle w:val="HTMLCode"/>
+          <w:rFonts w:eastAsiaTheme="majorEastAsia"/>
+        </w:rPr>
+        <w:t>Admin</w:t>
+      </w:r>
+      <w:r>
+        <w:t xml:space="preserve"> table and linked with other tables using foreign keys.</w:t>
+      </w:r>
+    </w:p>
+    <w:p>
+      <w:r>
+        <w:pict w14:anchorId="759C1914">
+          <v:rect id="_x0000_i1031" style="width:0;height:1.5pt" o:hralign="center" o:hrstd="t" o:hr="t" fillcolor="#a0a0a0" stroked="f"/>
+        </w:pict>
+      </w:r>
+    </w:p>
+    <w:p>
+      <w:pPr>
+        <w:pStyle w:val="Heading2"/>
+      </w:pPr>
+      <w:r>
+        <w:t>2. Judge Data Flow</w:t>
+      </w:r>
+    </w:p>
+    <w:p>
+      <w:pPr>
+        <w:pStyle w:val="NormalWeb"/>
+      </w:pPr>
+      <w:r>
+        <w:t>After admins are created, judges are added to the system. Each judge:</w:t>
+      </w:r>
+    </w:p>
+    <w:p>
+      <w:pPr>
+        <w:numPr>
+          <w:ilvl w:val="0"/>
+          <w:numId w:val="20"/>
+        </w:numPr>
+        <w:spacing w:before="100" w:beforeAutospacing="1" w:after="100" w:afterAutospacing="1" w:line="240" w:lineRule="auto"/>
+      </w:pPr>
+      <w:r>
+        <w:t xml:space="preserve">Is assigned by an admin </w:t>
+      </w:r>
+    </w:p>
+    <w:p>
+      <w:pPr>
+        <w:numPr>
+          <w:ilvl w:val="0"/>
+          <w:numId w:val="20"/>
+        </w:numPr>
+        <w:spacing w:before="100" w:beforeAutospacing="1" w:after="100" w:afterAutospacing="1" w:line="240" w:lineRule="auto"/>
+      </w:pPr>
+      <w:r>
+        <w:t xml:space="preserve">Has a specialization such as Criminal, Civil, Family, or Corporate law </w:t>
+      </w:r>
+    </w:p>
+    <w:p>
+      <w:pPr>
+        <w:numPr>
+          <w:ilvl w:val="0"/>
+          <w:numId w:val="20"/>
+        </w:numPr>
+        <w:spacing w:before="100" w:beforeAutospacing="1" w:after="100" w:afterAutospacing="1" w:line="240" w:lineRule="auto"/>
+      </w:pPr>
+      <w:r>
+        <w:t xml:space="preserve">Can be assigned multiple cases </w:t>
+      </w:r>
+    </w:p>
+    <w:p>
+      <w:pPr>
+        <w:pStyle w:val="NormalWeb"/>
+      </w:pPr>
+      <w:r>
+        <w:t xml:space="preserve">Judge data flows from the </w:t>
+      </w:r>
+      <w:r>
+        <w:rPr>
+          <w:rStyle w:val="HTMLCode"/>
+          <w:rFonts w:eastAsiaTheme="majorEastAsia"/>
+        </w:rPr>
+        <w:t>Admin</w:t>
+      </w:r>
+      <w:r>
+        <w:t xml:space="preserve"> entity into the </w:t>
+      </w:r>
+      <w:r>
+        <w:rPr>
+          <w:rStyle w:val="HTMLCode"/>
+          <w:rFonts w:eastAsiaTheme="majorEastAsia"/>
+        </w:rPr>
+        <w:t>Judge</w:t>
+      </w:r>
+      <w:r>
+        <w:t xml:space="preserve"> table through the </w:t>
+      </w:r>
+      <w:proofErr w:type="spellStart"/>
+      <w:r>
+        <w:rPr>
+          <w:rStyle w:val="HTMLCode"/>
+          <w:rFonts w:eastAsiaTheme="majorEastAsia"/>
+        </w:rPr>
+        <w:t>assigned_by_admin_id</w:t>
+      </w:r>
+      <w:proofErr w:type="spellEnd"/>
+      <w:r>
+        <w:t xml:space="preserve"> foreign key relationship.</w:t>
+      </w:r>
+    </w:p>
+    <w:p>
+      <w:r>
+        <w:pict w14:anchorId="007AF873">
+          <v:rect id="_x0000_i1032" style="width:0;height:1.5pt" o:hralign="center" o:hrstd="t" o:hr="t" fillcolor="#a0a0a0" stroked="f"/>
+        </w:pict>
+      </w:r>
+    </w:p>
+    <w:p>
+      <w:pPr>
+        <w:pStyle w:val="Heading2"/>
+      </w:pPr>
+      <w:r>
+        <w:t>3. Case Data Flow</w:t>
+      </w:r>
+    </w:p>
+    <w:p>
+      <w:pPr>
+        <w:pStyle w:val="NormalWeb"/>
+      </w:pPr>
+      <w:r>
+        <w:t>Cases are created and managed by admins. During case creation:</w:t>
+      </w:r>
+    </w:p>
+    <w:p>
+      <w:pPr>
+        <w:numPr>
+          <w:ilvl w:val="0"/>
+          <w:numId w:val="21"/>
+        </w:numPr>
+        <w:spacing w:before="100" w:beforeAutospacing="1" w:after="100" w:afterAutospacing="1" w:line="240" w:lineRule="auto"/>
+      </w:pPr>
+      <w:r>
+        <w:t xml:space="preserve">A unique case number is generated </w:t>
+      </w:r>
+    </w:p>
+    <w:p>
+      <w:pPr>
+        <w:numPr>
+          <w:ilvl w:val="0"/>
+          <w:numId w:val="21"/>
+        </w:numPr>
+        <w:spacing w:before="100" w:beforeAutospacing="1" w:after="100" w:afterAutospacing="1" w:line="240" w:lineRule="auto"/>
+      </w:pPr>
+      <w:r>
+        <w:t xml:space="preserve">Plaintiff and defendant information is recorded </w:t>
+      </w:r>
+    </w:p>
+    <w:p>
+      <w:pPr>
+        <w:numPr>
+          <w:ilvl w:val="0"/>
+          <w:numId w:val="21"/>
+        </w:numPr>
+        <w:spacing w:before="100" w:beforeAutospacing="1" w:after="100" w:afterAutospacing="1" w:line="240" w:lineRule="auto"/>
+      </w:pPr>
+      <w:r>
+        <w:t xml:space="preserve">A judge is assigned to the case </w:t>
+      </w:r>
+    </w:p>
+    <w:p>
+      <w:pPr>
+        <w:numPr>
+          <w:ilvl w:val="0"/>
+          <w:numId w:val="21"/>
+        </w:numPr>
+        <w:spacing w:before="100" w:beforeAutospacing="1" w:after="100" w:afterAutospacing="1" w:line="240" w:lineRule="auto"/>
+      </w:pPr>
+      <w:r>
+        <w:t xml:space="preserve">Case status and priority are defined </w:t>
+      </w:r>
+    </w:p>
+    <w:p>
+      <w:pPr>
+        <w:numPr>
+          <w:ilvl w:val="0"/>
+          <w:numId w:val="21"/>
+        </w:numPr>
+        <w:spacing w:before="100" w:beforeAutospacing="1" w:after="100" w:afterAutospacing="1" w:line="240" w:lineRule="auto"/>
+      </w:pPr>
+      <w:r>
+        <w:t xml:space="preserve">A PDF document path is attached for legal documentation </w:t>
+      </w:r>
+    </w:p>
+    <w:p>
+      <w:pPr>
+        <w:pStyle w:val="NormalWeb"/>
+      </w:pPr>
+      <w:r>
+        <w:t xml:space="preserve">The </w:t>
+      </w:r>
+      <w:r>
+        <w:rPr>
+          <w:rStyle w:val="HTMLCode"/>
+          <w:rFonts w:eastAsiaTheme="majorEastAsia"/>
+        </w:rPr>
+        <w:t>Case</w:t>
+      </w:r>
+      <w:r>
+        <w:t xml:space="preserve"> table acts as the central entity of the system because it connects both judges and hearings.</w:t>
+      </w:r>
+    </w:p>
+    <w:p>
+      <w:pPr>
+        <w:pStyle w:val="NormalWeb"/>
+      </w:pPr>
+      <w:r>
+        <w:t>The flow of data for a case is:</w:t>
+      </w:r>
+      <w:r>
+        <w:br/>
+        <w:t>Admin → Case → Judge Assignment → Document Storage</w:t>
+      </w:r>
+    </w:p>
+    <w:p>
+      <w:r>
+        <w:lastRenderedPageBreak/>
+        <w:pict w14:anchorId="089A01B6">
+          <v:rect id="_x0000_i1033" style="width:0;height:1.5pt" o:hralign="center" o:hrstd="t" o:hr="t" fillcolor="#a0a0a0" stroked="f"/>
+        </w:pict>
+      </w:r>
+    </w:p>
+    <w:p>
+      <w:pPr>
+        <w:pStyle w:val="Heading2"/>
+      </w:pPr>
+      <w:r>
+        <w:t>4. Hearing Data Flow</w:t>
+      </w:r>
+    </w:p>
+    <w:p>
+      <w:pPr>
+        <w:pStyle w:val="NormalWeb"/>
+      </w:pPr>
+      <w:r>
+        <w:t>Once a case is registered, hearings are scheduled for the case. Each hearing includes:</w:t>
+      </w:r>
+    </w:p>
+    <w:p>
+      <w:pPr>
+        <w:numPr>
+          <w:ilvl w:val="0"/>
+          <w:numId w:val="22"/>
+        </w:numPr>
+        <w:spacing w:before="100" w:beforeAutospacing="1" w:after="100" w:afterAutospacing="1" w:line="240" w:lineRule="auto"/>
+      </w:pPr>
+      <w:r>
+        <w:t xml:space="preserve">Hearing date and time </w:t>
+      </w:r>
+    </w:p>
+    <w:p>
+      <w:pPr>
+        <w:numPr>
+          <w:ilvl w:val="0"/>
+          <w:numId w:val="22"/>
+        </w:numPr>
+        <w:spacing w:before="100" w:beforeAutospacing="1" w:after="100" w:afterAutospacing="1" w:line="240" w:lineRule="auto"/>
+      </w:pPr>
+      <w:r>
+        <w:t xml:space="preserve">Courtroom information </w:t>
+      </w:r>
+    </w:p>
+    <w:p>
+      <w:pPr>
+        <w:numPr>
+          <w:ilvl w:val="0"/>
+          <w:numId w:val="22"/>
+        </w:numPr>
+        <w:spacing w:before="100" w:beforeAutospacing="1" w:after="100" w:afterAutospacing="1" w:line="240" w:lineRule="auto"/>
+      </w:pPr>
+      <w:r>
+        <w:t xml:space="preserve">Hearing type </w:t>
+      </w:r>
+    </w:p>
+    <w:p>
+      <w:pPr>
+        <w:numPr>
+          <w:ilvl w:val="0"/>
+          <w:numId w:val="22"/>
+        </w:numPr>
+        <w:spacing w:before="100" w:beforeAutospacing="1" w:after="100" w:afterAutospacing="1" w:line="240" w:lineRule="auto"/>
+      </w:pPr>
+      <w:r>
+        <w:t xml:space="preserve">Hearing status </w:t>
+      </w:r>
+    </w:p>
+    <w:p>
+      <w:pPr>
+        <w:numPr>
+          <w:ilvl w:val="0"/>
+          <w:numId w:val="22"/>
+        </w:numPr>
+        <w:spacing w:before="100" w:beforeAutospacing="1" w:after="100" w:afterAutospacing="1" w:line="240" w:lineRule="auto"/>
+      </w:pPr>
+      <w:r>
+        <w:t xml:space="preserve">Notes and remarks </w:t>
+      </w:r>
+    </w:p>
+    <w:p>
+      <w:pPr>
+        <w:pStyle w:val="NormalWeb"/>
+      </w:pPr>
+      <w:r>
+        <w:t>The hearing process depends on the current status of the case:</w:t>
+      </w:r>
+    </w:p>
+    <w:p>
+      <w:pPr>
+        <w:numPr>
+          <w:ilvl w:val="0"/>
+          <w:numId w:val="23"/>
+        </w:numPr>
+        <w:spacing w:before="100" w:beforeAutospacing="1" w:after="100" w:afterAutospacing="1" w:line="240" w:lineRule="auto"/>
+      </w:pPr>
+      <w:r>
+        <w:t xml:space="preserve">Pending and Under Review cases receive future hearing dates </w:t>
+      </w:r>
+    </w:p>
+    <w:p>
+      <w:pPr>
+        <w:numPr>
+          <w:ilvl w:val="0"/>
+          <w:numId w:val="23"/>
+        </w:numPr>
+        <w:spacing w:before="100" w:beforeAutospacing="1" w:after="100" w:afterAutospacing="1" w:line="240" w:lineRule="auto"/>
+      </w:pPr>
+      <w:r>
+        <w:t xml:space="preserve">Heard and Closed cases have completed hearings </w:t>
+      </w:r>
+    </w:p>
+    <w:p>
+      <w:pPr>
+        <w:numPr>
+          <w:ilvl w:val="0"/>
+          <w:numId w:val="23"/>
+        </w:numPr>
+        <w:spacing w:before="100" w:beforeAutospacing="1" w:after="100" w:afterAutospacing="1" w:line="240" w:lineRule="auto"/>
+      </w:pPr>
+      <w:r>
+        <w:t xml:space="preserve">Dismissed cases contain cancelled hearings and no next hearing date </w:t>
+      </w:r>
+    </w:p>
+    <w:p>
+      <w:pPr>
+        <w:pStyle w:val="NormalWeb"/>
+      </w:pPr>
+      <w:r>
+        <w:t xml:space="preserve">Each hearing record is linked to a case using the </w:t>
+      </w:r>
+      <w:proofErr w:type="spellStart"/>
+      <w:r>
+        <w:rPr>
+          <w:rStyle w:val="HTMLCode"/>
+          <w:rFonts w:eastAsiaTheme="majorEastAsia"/>
+        </w:rPr>
+        <w:t>case_id</w:t>
+      </w:r>
+      <w:proofErr w:type="spellEnd"/>
+      <w:r>
+        <w:t xml:space="preserve"> foreign key.</w:t>
+      </w:r>
+    </w:p>
+    <w:p>
+      <w:r>
+        <w:pict w14:anchorId="174063DC">
+          <v:rect id="_x0000_i1034" style="width:0;height:1.5pt" o:hralign="center" o:hrstd="t" o:hr="t" fillcolor="#a0a0a0" stroked="f"/>
+        </w:pict>
+      </w:r>
+    </w:p>
+    <w:p>
+      <w:pPr>
+        <w:pStyle w:val="Heading2"/>
+      </w:pPr>
+      <w:r>
+        <w:t>5. PDF Document Flow</w:t>
+      </w:r>
+    </w:p>
+    <w:p>
+      <w:pPr>
+        <w:pStyle w:val="NormalWeb"/>
+      </w:pPr>
+      <w:r>
+        <w:t>Each case contains a PDF document path that points to legal case files stored locally in the system directory:</w:t>
+      </w:r>
+    </w:p>
+    <w:p>
+      <w:pPr>
+        <w:pStyle w:val="NormalWeb"/>
+      </w:pPr>
+      <w:r>
+        <w:pict w14:anchorId="7C06BF94">
+          <v:rect id="_x0000_i1039" style="width:0;height:1.5pt" o:hralign="center" o:hrstd="t" o:hr="t" fillcolor="#a0a0a0" stroked="f"/>
+        </w:pict>
+      </w:r>
+    </w:p>
+    <w:p>
+      <w:pPr>
+        <w:pStyle w:val="NormalWeb"/>
+      </w:pPr>
+      <w:r>
+        <w:t xml:space="preserve">GITHUB LINK: </w:t>
+      </w:r>
+      <w:r>
+        <w:t>https://github.com/GMLOL-DEV</w:t>
+      </w:r>
+      <w:bookmarkStart w:id="0" w:name="_GoBack"/>
+      <w:bookmarkEnd w:id="0"/>
+    </w:p>
+    <w:p>
+      <w:pPr>
+        <w:pStyle w:val="NormalWeb"/>
+      </w:pPr>
+    </w:p>
+    <w:p>
+      <w:pPr>
+        <w:pStyle w:val="font-claude-response-body"/>
+      </w:pPr>
     </w:p>
     <w:p>
       <w:pPr>
@@ -5683,6 +6194,602 @@
     </w:lvl>
   </w:abstractNum>
   <w:abstractNum w:abstractNumId="6" w15:restartNumberingAfterBreak="0">
+    <w:nsid w:val="0D064B5D"/>
+    <w:multiLevelType w:val="multilevel"/>
+    <w:tmpl w:val="0BC269CA"/>
+    <w:lvl w:ilvl="0">
+      <w:start w:val="1"/>
+      <w:numFmt w:val="bullet"/>
+      <w:lvlText w:val=""/>
+      <w:lvlJc w:val="left"/>
+      <w:pPr>
+        <w:tabs>
+          <w:tab w:val="num" w:pos="720"/>
+        </w:tabs>
+        <w:ind w:left="720" w:hanging="360"/>
+      </w:pPr>
+      <w:rPr>
+        <w:rFonts w:ascii="Symbol" w:hAnsi="Symbol" w:hint="default"/>
+        <w:sz w:val="20"/>
+      </w:rPr>
+    </w:lvl>
+    <w:lvl w:ilvl="1" w:tentative="1">
+      <w:start w:val="1"/>
+      <w:numFmt w:val="bullet"/>
+      <w:lvlText w:val="o"/>
+      <w:lvlJc w:val="left"/>
+      <w:pPr>
+        <w:tabs>
+          <w:tab w:val="num" w:pos="1440"/>
+        </w:tabs>
+        <w:ind w:left="1440" w:hanging="360"/>
+      </w:pPr>
+      <w:rPr>
+        <w:rFonts w:ascii="Courier New" w:hAnsi="Courier New" w:hint="default"/>
+        <w:sz w:val="20"/>
+      </w:rPr>
+    </w:lvl>
+    <w:lvl w:ilvl="2" w:tentative="1">
+      <w:start w:val="1"/>
+      <w:numFmt w:val="bullet"/>
+      <w:lvlText w:val=""/>
+      <w:lvlJc w:val="left"/>
+      <w:pPr>
+        <w:tabs>
+          <w:tab w:val="num" w:pos="2160"/>
+        </w:tabs>
+        <w:ind w:left="2160" w:hanging="360"/>
+      </w:pPr>
+      <w:rPr>
+        <w:rFonts w:ascii="Wingdings" w:hAnsi="Wingdings" w:hint="default"/>
+        <w:sz w:val="20"/>
+      </w:rPr>
+    </w:lvl>
+    <w:lvl w:ilvl="3" w:tentative="1">
+      <w:start w:val="1"/>
+      <w:numFmt w:val="bullet"/>
+      <w:lvlText w:val=""/>
+      <w:lvlJc w:val="left"/>
+      <w:pPr>
+        <w:tabs>
+          <w:tab w:val="num" w:pos="2880"/>
+        </w:tabs>
+        <w:ind w:left="2880" w:hanging="360"/>
+      </w:pPr>
+      <w:rPr>
+        <w:rFonts w:ascii="Wingdings" w:hAnsi="Wingdings" w:hint="default"/>
+        <w:sz w:val="20"/>
+      </w:rPr>
+    </w:lvl>
+    <w:lvl w:ilvl="4" w:tentative="1">
+      <w:start w:val="1"/>
+      <w:numFmt w:val="bullet"/>
+      <w:lvlText w:val=""/>
+      <w:lvlJc w:val="left"/>
+      <w:pPr>
+        <w:tabs>
+          <w:tab w:val="num" w:pos="3600"/>
+        </w:tabs>
+        <w:ind w:left="3600" w:hanging="360"/>
+      </w:pPr>
+      <w:rPr>
+        <w:rFonts w:ascii="Wingdings" w:hAnsi="Wingdings" w:hint="default"/>
+        <w:sz w:val="20"/>
+      </w:rPr>
+    </w:lvl>
+    <w:lvl w:ilvl="5" w:tentative="1">
+      <w:start w:val="1"/>
+      <w:numFmt w:val="bullet"/>
+      <w:lvlText w:val=""/>
+      <w:lvlJc w:val="left"/>
+      <w:pPr>
+        <w:tabs>
+          <w:tab w:val="num" w:pos="4320"/>
+        </w:tabs>
+        <w:ind w:left="4320" w:hanging="360"/>
+      </w:pPr>
+      <w:rPr>
+        <w:rFonts w:ascii="Wingdings" w:hAnsi="Wingdings" w:hint="default"/>
+        <w:sz w:val="20"/>
+      </w:rPr>
+    </w:lvl>
+    <w:lvl w:ilvl="6" w:tentative="1">
+      <w:start w:val="1"/>
+      <w:numFmt w:val="bullet"/>
+      <w:lvlText w:val=""/>
+      <w:lvlJc w:val="left"/>
+      <w:pPr>
+        <w:tabs>
+          <w:tab w:val="num" w:pos="5040"/>
+        </w:tabs>
+        <w:ind w:left="5040" w:hanging="360"/>
+      </w:pPr>
+      <w:rPr>
+        <w:rFonts w:ascii="Wingdings" w:hAnsi="Wingdings" w:hint="default"/>
+        <w:sz w:val="20"/>
+      </w:rPr>
+    </w:lvl>
+    <w:lvl w:ilvl="7" w:tentative="1">
+      <w:start w:val="1"/>
+      <w:numFmt w:val="bullet"/>
+      <w:lvlText w:val=""/>
+      <w:lvlJc w:val="left"/>
+      <w:pPr>
+        <w:tabs>
+          <w:tab w:val="num" w:pos="5760"/>
+        </w:tabs>
+        <w:ind w:left="5760" w:hanging="360"/>
+      </w:pPr>
+      <w:rPr>
+        <w:rFonts w:ascii="Wingdings" w:hAnsi="Wingdings" w:hint="default"/>
+        <w:sz w:val="20"/>
+      </w:rPr>
+    </w:lvl>
+    <w:lvl w:ilvl="8" w:tentative="1">
+      <w:start w:val="1"/>
+      <w:numFmt w:val="bullet"/>
+      <w:lvlText w:val=""/>
+      <w:lvlJc w:val="left"/>
+      <w:pPr>
+        <w:tabs>
+          <w:tab w:val="num" w:pos="6480"/>
+        </w:tabs>
+        <w:ind w:left="6480" w:hanging="360"/>
+      </w:pPr>
+      <w:rPr>
+        <w:rFonts w:ascii="Wingdings" w:hAnsi="Wingdings" w:hint="default"/>
+        <w:sz w:val="20"/>
+      </w:rPr>
+    </w:lvl>
+  </w:abstractNum>
+  <w:abstractNum w:abstractNumId="7" w15:restartNumberingAfterBreak="0">
+    <w:nsid w:val="1FB05874"/>
+    <w:multiLevelType w:val="multilevel"/>
+    <w:tmpl w:val="31C6F332"/>
+    <w:lvl w:ilvl="0">
+      <w:start w:val="1"/>
+      <w:numFmt w:val="bullet"/>
+      <w:lvlText w:val=""/>
+      <w:lvlJc w:val="left"/>
+      <w:pPr>
+        <w:tabs>
+          <w:tab w:val="num" w:pos="720"/>
+        </w:tabs>
+        <w:ind w:left="720" w:hanging="360"/>
+      </w:pPr>
+      <w:rPr>
+        <w:rFonts w:ascii="Symbol" w:hAnsi="Symbol" w:hint="default"/>
+        <w:sz w:val="20"/>
+      </w:rPr>
+    </w:lvl>
+    <w:lvl w:ilvl="1" w:tentative="1">
+      <w:start w:val="1"/>
+      <w:numFmt w:val="bullet"/>
+      <w:lvlText w:val="o"/>
+      <w:lvlJc w:val="left"/>
+      <w:pPr>
+        <w:tabs>
+          <w:tab w:val="num" w:pos="1440"/>
+        </w:tabs>
+        <w:ind w:left="1440" w:hanging="360"/>
+      </w:pPr>
+      <w:rPr>
+        <w:rFonts w:ascii="Courier New" w:hAnsi="Courier New" w:hint="default"/>
+        <w:sz w:val="20"/>
+      </w:rPr>
+    </w:lvl>
+    <w:lvl w:ilvl="2" w:tentative="1">
+      <w:start w:val="1"/>
+      <w:numFmt w:val="bullet"/>
+      <w:lvlText w:val=""/>
+      <w:lvlJc w:val="left"/>
+      <w:pPr>
+        <w:tabs>
+          <w:tab w:val="num" w:pos="2160"/>
+        </w:tabs>
+        <w:ind w:left="2160" w:hanging="360"/>
+      </w:pPr>
+      <w:rPr>
+        <w:rFonts w:ascii="Wingdings" w:hAnsi="Wingdings" w:hint="default"/>
+        <w:sz w:val="20"/>
+      </w:rPr>
+    </w:lvl>
+    <w:lvl w:ilvl="3" w:tentative="1">
+      <w:start w:val="1"/>
+      <w:numFmt w:val="bullet"/>
+      <w:lvlText w:val=""/>
+      <w:lvlJc w:val="left"/>
+      <w:pPr>
+        <w:tabs>
+          <w:tab w:val="num" w:pos="2880"/>
+        </w:tabs>
+        <w:ind w:left="2880" w:hanging="360"/>
+      </w:pPr>
+      <w:rPr>
+        <w:rFonts w:ascii="Wingdings" w:hAnsi="Wingdings" w:hint="default"/>
+        <w:sz w:val="20"/>
+      </w:rPr>
+    </w:lvl>
+    <w:lvl w:ilvl="4" w:tentative="1">
+      <w:start w:val="1"/>
+      <w:numFmt w:val="bullet"/>
+      <w:lvlText w:val=""/>
+      <w:lvlJc w:val="left"/>
+      <w:pPr>
+        <w:tabs>
+          <w:tab w:val="num" w:pos="3600"/>
+        </w:tabs>
+        <w:ind w:left="3600" w:hanging="360"/>
+      </w:pPr>
+      <w:rPr>
+        <w:rFonts w:ascii="Wingdings" w:hAnsi="Wingdings" w:hint="default"/>
+        <w:sz w:val="20"/>
+      </w:rPr>
+    </w:lvl>
+    <w:lvl w:ilvl="5" w:tentative="1">
+      <w:start w:val="1"/>
+      <w:numFmt w:val="bullet"/>
+      <w:lvlText w:val=""/>
+      <w:lvlJc w:val="left"/>
+      <w:pPr>
+        <w:tabs>
+          <w:tab w:val="num" w:pos="4320"/>
+        </w:tabs>
+        <w:ind w:left="4320" w:hanging="360"/>
+      </w:pPr>
+      <w:rPr>
+        <w:rFonts w:ascii="Wingdings" w:hAnsi="Wingdings" w:hint="default"/>
+        <w:sz w:val="20"/>
+      </w:rPr>
+    </w:lvl>
+    <w:lvl w:ilvl="6" w:tentative="1">
+      <w:start w:val="1"/>
+      <w:numFmt w:val="bullet"/>
+      <w:lvlText w:val=""/>
+      <w:lvlJc w:val="left"/>
+      <w:pPr>
+        <w:tabs>
+          <w:tab w:val="num" w:pos="5040"/>
+        </w:tabs>
+        <w:ind w:left="5040" w:hanging="360"/>
+      </w:pPr>
+      <w:rPr>
+        <w:rFonts w:ascii="Wingdings" w:hAnsi="Wingdings" w:hint="default"/>
+        <w:sz w:val="20"/>
+      </w:rPr>
+    </w:lvl>
+    <w:lvl w:ilvl="7" w:tentative="1">
+      <w:start w:val="1"/>
+      <w:numFmt w:val="bullet"/>
+      <w:lvlText w:val=""/>
+      <w:lvlJc w:val="left"/>
+      <w:pPr>
+        <w:tabs>
+          <w:tab w:val="num" w:pos="5760"/>
+        </w:tabs>
+        <w:ind w:left="5760" w:hanging="360"/>
+      </w:pPr>
+      <w:rPr>
+        <w:rFonts w:ascii="Wingdings" w:hAnsi="Wingdings" w:hint="default"/>
+        <w:sz w:val="20"/>
+      </w:rPr>
+    </w:lvl>
+    <w:lvl w:ilvl="8" w:tentative="1">
+      <w:start w:val="1"/>
+      <w:numFmt w:val="bullet"/>
+      <w:lvlText w:val=""/>
+      <w:lvlJc w:val="left"/>
+      <w:pPr>
+        <w:tabs>
+          <w:tab w:val="num" w:pos="6480"/>
+        </w:tabs>
+        <w:ind w:left="6480" w:hanging="360"/>
+      </w:pPr>
+      <w:rPr>
+        <w:rFonts w:ascii="Wingdings" w:hAnsi="Wingdings" w:hint="default"/>
+        <w:sz w:val="20"/>
+      </w:rPr>
+    </w:lvl>
+  </w:abstractNum>
+  <w:abstractNum w:abstractNumId="8" w15:restartNumberingAfterBreak="0">
+    <w:nsid w:val="22EE46BD"/>
+    <w:multiLevelType w:val="multilevel"/>
+    <w:tmpl w:val="F7DC6CD6"/>
+    <w:lvl w:ilvl="0">
+      <w:start w:val="1"/>
+      <w:numFmt w:val="bullet"/>
+      <w:lvlText w:val=""/>
+      <w:lvlJc w:val="left"/>
+      <w:pPr>
+        <w:tabs>
+          <w:tab w:val="num" w:pos="720"/>
+        </w:tabs>
+        <w:ind w:left="720" w:hanging="360"/>
+      </w:pPr>
+      <w:rPr>
+        <w:rFonts w:ascii="Symbol" w:hAnsi="Symbol" w:hint="default"/>
+        <w:sz w:val="20"/>
+      </w:rPr>
+    </w:lvl>
+    <w:lvl w:ilvl="1" w:tentative="1">
+      <w:start w:val="1"/>
+      <w:numFmt w:val="bullet"/>
+      <w:lvlText w:val="o"/>
+      <w:lvlJc w:val="left"/>
+      <w:pPr>
+        <w:tabs>
+          <w:tab w:val="num" w:pos="1440"/>
+        </w:tabs>
+        <w:ind w:left="1440" w:hanging="360"/>
+      </w:pPr>
+      <w:rPr>
+        <w:rFonts w:ascii="Courier New" w:hAnsi="Courier New" w:hint="default"/>
+        <w:sz w:val="20"/>
+      </w:rPr>
+    </w:lvl>
+    <w:lvl w:ilvl="2" w:tentative="1">
+      <w:start w:val="1"/>
+      <w:numFmt w:val="bullet"/>
+      <w:lvlText w:val=""/>
+      <w:lvlJc w:val="left"/>
+      <w:pPr>
+        <w:tabs>
+          <w:tab w:val="num" w:pos="2160"/>
+        </w:tabs>
+        <w:ind w:left="2160" w:hanging="360"/>
+      </w:pPr>
+      <w:rPr>
+        <w:rFonts w:ascii="Wingdings" w:hAnsi="Wingdings" w:hint="default"/>
+        <w:sz w:val="20"/>
+      </w:rPr>
+    </w:lvl>
+    <w:lvl w:ilvl="3" w:tentative="1">
+      <w:start w:val="1"/>
+      <w:numFmt w:val="bullet"/>
+      <w:lvlText w:val=""/>
+      <w:lvlJc w:val="left"/>
+      <w:pPr>
+        <w:tabs>
+          <w:tab w:val="num" w:pos="2880"/>
+        </w:tabs>
+        <w:ind w:left="2880" w:hanging="360"/>
+      </w:pPr>
+      <w:rPr>
+        <w:rFonts w:ascii="Wingdings" w:hAnsi="Wingdings" w:hint="default"/>
+        <w:sz w:val="20"/>
+      </w:rPr>
+    </w:lvl>
+    <w:lvl w:ilvl="4" w:tentative="1">
+      <w:start w:val="1"/>
+      <w:numFmt w:val="bullet"/>
+      <w:lvlText w:val=""/>
+      <w:lvlJc w:val="left"/>
+      <w:pPr>
+        <w:tabs>
+          <w:tab w:val="num" w:pos="3600"/>
+        </w:tabs>
+        <w:ind w:left="3600" w:hanging="360"/>
+      </w:pPr>
+      <w:rPr>
+        <w:rFonts w:ascii="Wingdings" w:hAnsi="Wingdings" w:hint="default"/>
+        <w:sz w:val="20"/>
+      </w:rPr>
+    </w:lvl>
+    <w:lvl w:ilvl="5" w:tentative="1">
+      <w:start w:val="1"/>
+      <w:numFmt w:val="bullet"/>
+      <w:lvlText w:val=""/>
+      <w:lvlJc w:val="left"/>
+      <w:pPr>
+        <w:tabs>
+          <w:tab w:val="num" w:pos="4320"/>
+        </w:tabs>
+        <w:ind w:left="4320" w:hanging="360"/>
+      </w:pPr>
+      <w:rPr>
+        <w:rFonts w:ascii="Wingdings" w:hAnsi="Wingdings" w:hint="default"/>
+        <w:sz w:val="20"/>
+      </w:rPr>
+    </w:lvl>
+    <w:lvl w:ilvl="6" w:tentative="1">
+      <w:start w:val="1"/>
+      <w:numFmt w:val="bullet"/>
+      <w:lvlText w:val=""/>
+      <w:lvlJc w:val="left"/>
+      <w:pPr>
+        <w:tabs>
+          <w:tab w:val="num" w:pos="5040"/>
+        </w:tabs>
+        <w:ind w:left="5040" w:hanging="360"/>
+      </w:pPr>
+      <w:rPr>
+        <w:rFonts w:ascii="Wingdings" w:hAnsi="Wingdings" w:hint="default"/>
+        <w:sz w:val="20"/>
+      </w:rPr>
+    </w:lvl>
+    <w:lvl w:ilvl="7" w:tentative="1">
+      <w:start w:val="1"/>
+      <w:numFmt w:val="bullet"/>
+      <w:lvlText w:val=""/>
+      <w:lvlJc w:val="left"/>
+      <w:pPr>
+        <w:tabs>
+          <w:tab w:val="num" w:pos="5760"/>
+        </w:tabs>
+        <w:ind w:left="5760" w:hanging="360"/>
+      </w:pPr>
+      <w:rPr>
+        <w:rFonts w:ascii="Wingdings" w:hAnsi="Wingdings" w:hint="default"/>
+        <w:sz w:val="20"/>
+      </w:rPr>
+    </w:lvl>
+    <w:lvl w:ilvl="8" w:tentative="1">
+      <w:start w:val="1"/>
+      <w:numFmt w:val="bullet"/>
+      <w:lvlText w:val=""/>
+      <w:lvlJc w:val="left"/>
+      <w:pPr>
+        <w:tabs>
+          <w:tab w:val="num" w:pos="6480"/>
+        </w:tabs>
+        <w:ind w:left="6480" w:hanging="360"/>
+      </w:pPr>
+      <w:rPr>
+        <w:rFonts w:ascii="Wingdings" w:hAnsi="Wingdings" w:hint="default"/>
+        <w:sz w:val="20"/>
+      </w:rPr>
+    </w:lvl>
+  </w:abstractNum>
+  <w:abstractNum w:abstractNumId="9" w15:restartNumberingAfterBreak="0">
+    <w:nsid w:val="26430F3B"/>
+    <w:multiLevelType w:val="multilevel"/>
+    <w:tmpl w:val="D716F6F8"/>
+    <w:lvl w:ilvl="0">
+      <w:start w:val="1"/>
+      <w:numFmt w:val="bullet"/>
+      <w:lvlText w:val=""/>
+      <w:lvlJc w:val="left"/>
+      <w:pPr>
+        <w:tabs>
+          <w:tab w:val="num" w:pos="720"/>
+        </w:tabs>
+        <w:ind w:left="720" w:hanging="360"/>
+      </w:pPr>
+      <w:rPr>
+        <w:rFonts w:ascii="Symbol" w:hAnsi="Symbol" w:hint="default"/>
+        <w:sz w:val="20"/>
+      </w:rPr>
+    </w:lvl>
+    <w:lvl w:ilvl="1" w:tentative="1">
+      <w:start w:val="1"/>
+      <w:numFmt w:val="bullet"/>
+      <w:lvlText w:val="o"/>
+      <w:lvlJc w:val="left"/>
+      <w:pPr>
+        <w:tabs>
+          <w:tab w:val="num" w:pos="1440"/>
+        </w:tabs>
+        <w:ind w:left="1440" w:hanging="360"/>
+      </w:pPr>
+      <w:rPr>
+        <w:rFonts w:ascii="Courier New" w:hAnsi="Courier New" w:hint="default"/>
+        <w:sz w:val="20"/>
+      </w:rPr>
+    </w:lvl>
+    <w:lvl w:ilvl="2" w:tentative="1">
+      <w:start w:val="1"/>
+      <w:numFmt w:val="bullet"/>
+      <w:lvlText w:val=""/>
+      <w:lvlJc w:val="left"/>
+      <w:pPr>
+        <w:tabs>
+          <w:tab w:val="num" w:pos="2160"/>
+        </w:tabs>
+        <w:ind w:left="2160" w:hanging="360"/>
+      </w:pPr>
+      <w:rPr>
+        <w:rFonts w:ascii="Wingdings" w:hAnsi="Wingdings" w:hint="default"/>
+        <w:sz w:val="20"/>
+      </w:rPr>
+    </w:lvl>
+    <w:lvl w:ilvl="3" w:tentative="1">
+      <w:start w:val="1"/>
+      <w:numFmt w:val="bullet"/>
+      <w:lvlText w:val=""/>
+      <w:lvlJc w:val="left"/>
+      <w:pPr>
+        <w:tabs>
+          <w:tab w:val="num" w:pos="2880"/>
+        </w:tabs>
+        <w:ind w:left="2880" w:hanging="360"/>
+      </w:pPr>
+      <w:rPr>
+        <w:rFonts w:ascii="Wingdings" w:hAnsi="Wingdings" w:hint="default"/>
+        <w:sz w:val="20"/>
+      </w:rPr>
+    </w:lvl>
+    <w:lvl w:ilvl="4" w:tentative="1">
+      <w:start w:val="1"/>
+      <w:numFmt w:val="bullet"/>
+      <w:lvlText w:val=""/>
+      <w:lvlJc w:val="left"/>
+      <w:pPr>
+        <w:tabs>
+          <w:tab w:val="num" w:pos="3600"/>
+        </w:tabs>
+        <w:ind w:left="3600" w:hanging="360"/>
+      </w:pPr>
+      <w:rPr>
+        <w:rFonts w:ascii="Wingdings" w:hAnsi="Wingdings" w:hint="default"/>
+        <w:sz w:val="20"/>
+      </w:rPr>
+    </w:lvl>
+    <w:lvl w:ilvl="5" w:tentative="1">
+      <w:start w:val="1"/>
+      <w:numFmt w:val="bullet"/>
+      <w:lvlText w:val=""/>
+      <w:lvlJc w:val="left"/>
+      <w:pPr>
+        <w:tabs>
+          <w:tab w:val="num" w:pos="4320"/>
+        </w:tabs>
+        <w:ind w:left="4320" w:hanging="360"/>
+      </w:pPr>
+      <w:rPr>
+        <w:rFonts w:ascii="Wingdings" w:hAnsi="Wingdings" w:hint="default"/>
+        <w:sz w:val="20"/>
+      </w:rPr>
+    </w:lvl>
+    <w:lvl w:ilvl="6" w:tentative="1">
+      <w:start w:val="1"/>
+      <w:numFmt w:val="bullet"/>
+      <w:lvlText w:val=""/>
+      <w:lvlJc w:val="left"/>
+      <w:pPr>
+        <w:tabs>
+          <w:tab w:val="num" w:pos="5040"/>
+        </w:tabs>
+        <w:ind w:left="5040" w:hanging="360"/>
+      </w:pPr>
+      <w:rPr>
+        <w:rFonts w:ascii="Wingdings" w:hAnsi="Wingdings" w:hint="default"/>
+        <w:sz w:val="20"/>
+      </w:rPr>
+    </w:lvl>
+    <w:lvl w:ilvl="7" w:tentative="1">
+      <w:start w:val="1"/>
+      <w:numFmt w:val="bullet"/>
+      <w:lvlText w:val=""/>
+      <w:lvlJc w:val="left"/>
+      <w:pPr>
+        <w:tabs>
+          <w:tab w:val="num" w:pos="5760"/>
+        </w:tabs>
+        <w:ind w:left="5760" w:hanging="360"/>
+      </w:pPr>
+      <w:rPr>
+        <w:rFonts w:ascii="Wingdings" w:hAnsi="Wingdings" w:hint="default"/>
+        <w:sz w:val="20"/>
+      </w:rPr>
+    </w:lvl>
+    <w:lvl w:ilvl="8" w:tentative="1">
+      <w:start w:val="1"/>
+      <w:numFmt w:val="bullet"/>
+      <w:lvlText w:val=""/>
+      <w:lvlJc w:val="left"/>
+      <w:pPr>
+        <w:tabs>
+          <w:tab w:val="num" w:pos="6480"/>
+        </w:tabs>
+        <w:ind w:left="6480" w:hanging="360"/>
+      </w:pPr>
+      <w:rPr>
+        <w:rFonts w:ascii="Wingdings" w:hAnsi="Wingdings" w:hint="default"/>
+        <w:sz w:val="20"/>
+      </w:rPr>
+    </w:lvl>
+  </w:abstractNum>
+  <w:abstractNum w:abstractNumId="10" w15:restartNumberingAfterBreak="0">
     <w:nsid w:val="2B841F48"/>
     <w:multiLevelType w:val="multilevel"/>
     <w:tmpl w:val="9AD44ED8"/>
@@ -5831,7 +6938,7 @@
       </w:rPr>
     </w:lvl>
   </w:abstractNum>
-  <w:abstractNum w:abstractNumId="7" w15:restartNumberingAfterBreak="0">
+  <w:abstractNum w:abstractNumId="11" w15:restartNumberingAfterBreak="0">
     <w:nsid w:val="2F7F5FD4"/>
     <w:multiLevelType w:val="multilevel"/>
     <w:tmpl w:val="0DD02F04"/>
@@ -5980,7 +7087,7 @@
       </w:rPr>
     </w:lvl>
   </w:abstractNum>
-  <w:abstractNum w:abstractNumId="8" w15:restartNumberingAfterBreak="0">
+  <w:abstractNum w:abstractNumId="12" w15:restartNumberingAfterBreak="0">
     <w:nsid w:val="33B67A4F"/>
     <w:multiLevelType w:val="multilevel"/>
     <w:tmpl w:val="0BF06BAC"/>
@@ -6129,7 +7236,7 @@
       </w:rPr>
     </w:lvl>
   </w:abstractNum>
-  <w:abstractNum w:abstractNumId="9" w15:restartNumberingAfterBreak="0">
+  <w:abstractNum w:abstractNumId="13" w15:restartNumberingAfterBreak="0">
     <w:nsid w:val="361C166D"/>
     <w:multiLevelType w:val="multilevel"/>
     <w:tmpl w:val="330CE3A4"/>
@@ -6278,7 +7385,7 @@
       </w:rPr>
     </w:lvl>
   </w:abstractNum>
-  <w:abstractNum w:abstractNumId="10" w15:restartNumberingAfterBreak="0">
+  <w:abstractNum w:abstractNumId="14" w15:restartNumberingAfterBreak="0">
     <w:nsid w:val="41D72780"/>
     <w:multiLevelType w:val="multilevel"/>
     <w:tmpl w:val="378424F4"/>
@@ -6427,7 +7534,7 @@
       </w:rPr>
     </w:lvl>
   </w:abstractNum>
-  <w:abstractNum w:abstractNumId="11" w15:restartNumberingAfterBreak="0">
+  <w:abstractNum w:abstractNumId="15" w15:restartNumberingAfterBreak="0">
     <w:nsid w:val="58F872C2"/>
     <w:multiLevelType w:val="multilevel"/>
     <w:tmpl w:val="9B940A00"/>
@@ -6576,7 +7683,7 @@
       </w:rPr>
     </w:lvl>
   </w:abstractNum>
-  <w:abstractNum w:abstractNumId="12" w15:restartNumberingAfterBreak="0">
+  <w:abstractNum w:abstractNumId="16" w15:restartNumberingAfterBreak="0">
     <w:nsid w:val="5A7C15FE"/>
     <w:multiLevelType w:val="multilevel"/>
     <w:tmpl w:val="B6A45818"/>
@@ -6725,7 +7832,7 @@
       </w:rPr>
     </w:lvl>
   </w:abstractNum>
-  <w:abstractNum w:abstractNumId="13" w15:restartNumberingAfterBreak="0">
+  <w:abstractNum w:abstractNumId="17" w15:restartNumberingAfterBreak="0">
     <w:nsid w:val="5BC71E77"/>
     <w:multiLevelType w:val="multilevel"/>
     <w:tmpl w:val="F96AF27A"/>
@@ -6874,7 +7981,7 @@
       </w:rPr>
     </w:lvl>
   </w:abstractNum>
-  <w:abstractNum w:abstractNumId="14" w15:restartNumberingAfterBreak="0">
+  <w:abstractNum w:abstractNumId="18" w15:restartNumberingAfterBreak="0">
     <w:nsid w:val="5F713E6C"/>
     <w:multiLevelType w:val="multilevel"/>
     <w:tmpl w:val="CD388208"/>
@@ -7023,7 +8130,7 @@
       </w:rPr>
     </w:lvl>
   </w:abstractNum>
-  <w:abstractNum w:abstractNumId="15" w15:restartNumberingAfterBreak="0">
+  <w:abstractNum w:abstractNumId="19" w15:restartNumberingAfterBreak="0">
     <w:nsid w:val="5FFE5EBB"/>
     <w:multiLevelType w:val="multilevel"/>
     <w:tmpl w:val="FF7003B4"/>
@@ -7172,7 +8279,7 @@
       </w:rPr>
     </w:lvl>
   </w:abstractNum>
-  <w:abstractNum w:abstractNumId="16" w15:restartNumberingAfterBreak="0">
+  <w:abstractNum w:abstractNumId="20" w15:restartNumberingAfterBreak="0">
     <w:nsid w:val="60F43D3E"/>
     <w:multiLevelType w:val="multilevel"/>
     <w:tmpl w:val="6F3A881A"/>
@@ -7321,7 +8428,156 @@
       </w:rPr>
     </w:lvl>
   </w:abstractNum>
-  <w:abstractNum w:abstractNumId="17" w15:restartNumberingAfterBreak="0">
+  <w:abstractNum w:abstractNumId="21" w15:restartNumberingAfterBreak="0">
+    <w:nsid w:val="74757B55"/>
+    <w:multiLevelType w:val="multilevel"/>
+    <w:tmpl w:val="90B60D8E"/>
+    <w:lvl w:ilvl="0">
+      <w:start w:val="1"/>
+      <w:numFmt w:val="bullet"/>
+      <w:lvlText w:val=""/>
+      <w:lvlJc w:val="left"/>
+      <w:pPr>
+        <w:tabs>
+          <w:tab w:val="num" w:pos="720"/>
+        </w:tabs>
+        <w:ind w:left="720" w:hanging="360"/>
+      </w:pPr>
+      <w:rPr>
+        <w:rFonts w:ascii="Symbol" w:hAnsi="Symbol" w:hint="default"/>
+        <w:sz w:val="20"/>
+      </w:rPr>
+    </w:lvl>
+    <w:lvl w:ilvl="1" w:tentative="1">
+      <w:start w:val="1"/>
+      <w:numFmt w:val="bullet"/>
+      <w:lvlText w:val="o"/>
+      <w:lvlJc w:val="left"/>
+      <w:pPr>
+        <w:tabs>
+          <w:tab w:val="num" w:pos="1440"/>
+        </w:tabs>
+        <w:ind w:left="1440" w:hanging="360"/>
+      </w:pPr>
+      <w:rPr>
+        <w:rFonts w:ascii="Courier New" w:hAnsi="Courier New" w:hint="default"/>
+        <w:sz w:val="20"/>
+      </w:rPr>
+    </w:lvl>
+    <w:lvl w:ilvl="2" w:tentative="1">
+      <w:start w:val="1"/>
+      <w:numFmt w:val="bullet"/>
+      <w:lvlText w:val=""/>
+      <w:lvlJc w:val="left"/>
+      <w:pPr>
+        <w:tabs>
+          <w:tab w:val="num" w:pos="2160"/>
+        </w:tabs>
+        <w:ind w:left="2160" w:hanging="360"/>
+      </w:pPr>
+      <w:rPr>
+        <w:rFonts w:ascii="Wingdings" w:hAnsi="Wingdings" w:hint="default"/>
+        <w:sz w:val="20"/>
+      </w:rPr>
+    </w:lvl>
+    <w:lvl w:ilvl="3" w:tentative="1">
+      <w:start w:val="1"/>
+      <w:numFmt w:val="bullet"/>
+      <w:lvlText w:val=""/>
+      <w:lvlJc w:val="left"/>
+      <w:pPr>
+        <w:tabs>
+          <w:tab w:val="num" w:pos="2880"/>
+        </w:tabs>
+        <w:ind w:left="2880" w:hanging="360"/>
+      </w:pPr>
+      <w:rPr>
+        <w:rFonts w:ascii="Wingdings" w:hAnsi="Wingdings" w:hint="default"/>
+        <w:sz w:val="20"/>
+      </w:rPr>
+    </w:lvl>
+    <w:lvl w:ilvl="4" w:tentative="1">
+      <w:start w:val="1"/>
+      <w:numFmt w:val="bullet"/>
+      <w:lvlText w:val=""/>
+      <w:lvlJc w:val="left"/>
+      <w:pPr>
+        <w:tabs>
+          <w:tab w:val="num" w:pos="3600"/>
+        </w:tabs>
+        <w:ind w:left="3600" w:hanging="360"/>
+      </w:pPr>
+      <w:rPr>
+        <w:rFonts w:ascii="Wingdings" w:hAnsi="Wingdings" w:hint="default"/>
+        <w:sz w:val="20"/>
+      </w:rPr>
+    </w:lvl>
+    <w:lvl w:ilvl="5" w:tentative="1">
+      <w:start w:val="1"/>
+      <w:numFmt w:val="bullet"/>
+      <w:lvlText w:val=""/>
+      <w:lvlJc w:val="left"/>
+      <w:pPr>
+        <w:tabs>
+          <w:tab w:val="num" w:pos="4320"/>
+        </w:tabs>
+        <w:ind w:left="4320" w:hanging="360"/>
+      </w:pPr>
+      <w:rPr>
+        <w:rFonts w:ascii="Wingdings" w:hAnsi="Wingdings" w:hint="default"/>
+        <w:sz w:val="20"/>
+      </w:rPr>
+    </w:lvl>
+    <w:lvl w:ilvl="6" w:tentative="1">
+      <w:start w:val="1"/>
+      <w:numFmt w:val="bullet"/>
+      <w:lvlText w:val=""/>
+      <w:lvlJc w:val="left"/>
+      <w:pPr>
+        <w:tabs>
+          <w:tab w:val="num" w:pos="5040"/>
+        </w:tabs>
+        <w:ind w:left="5040" w:hanging="360"/>
+      </w:pPr>
+      <w:rPr>
+        <w:rFonts w:ascii="Wingdings" w:hAnsi="Wingdings" w:hint="default"/>
+        <w:sz w:val="20"/>
+      </w:rPr>
+    </w:lvl>
+    <w:lvl w:ilvl="7" w:tentative="1">
+      <w:start w:val="1"/>
+      <w:numFmt w:val="bullet"/>
+      <w:lvlText w:val=""/>
+      <w:lvlJc w:val="left"/>
+      <w:pPr>
+        <w:tabs>
+          <w:tab w:val="num" w:pos="5760"/>
+        </w:tabs>
+        <w:ind w:left="5760" w:hanging="360"/>
+      </w:pPr>
+      <w:rPr>
+        <w:rFonts w:ascii="Wingdings" w:hAnsi="Wingdings" w:hint="default"/>
+        <w:sz w:val="20"/>
+      </w:rPr>
+    </w:lvl>
+    <w:lvl w:ilvl="8" w:tentative="1">
+      <w:start w:val="1"/>
+      <w:numFmt w:val="bullet"/>
+      <w:lvlText w:val=""/>
+      <w:lvlJc w:val="left"/>
+      <w:pPr>
+        <w:tabs>
+          <w:tab w:val="num" w:pos="6480"/>
+        </w:tabs>
+        <w:ind w:left="6480" w:hanging="360"/>
+      </w:pPr>
+      <w:rPr>
+        <w:rFonts w:ascii="Wingdings" w:hAnsi="Wingdings" w:hint="default"/>
+        <w:sz w:val="20"/>
+      </w:rPr>
+    </w:lvl>
+  </w:abstractNum>
+  <w:abstractNum w:abstractNumId="22" w15:restartNumberingAfterBreak="0">
     <w:nsid w:val="76200019"/>
     <w:multiLevelType w:val="multilevel"/>
     <w:tmpl w:val="FCD28840"/>
@@ -7471,28 +8727,28 @@
     </w:lvl>
   </w:abstractNum>
   <w:num w:numId="1">
-    <w:abstractNumId w:val="10"/>
+    <w:abstractNumId w:val="14"/>
   </w:num>
   <w:num w:numId="2">
     <w:abstractNumId w:val="1"/>
   </w:num>
   <w:num w:numId="3">
-    <w:abstractNumId w:val="12"/>
+    <w:abstractNumId w:val="16"/>
   </w:num>
   <w:num w:numId="4">
-    <w:abstractNumId w:val="17"/>
+    <w:abstractNumId w:val="22"/>
   </w:num>
   <w:num w:numId="5">
-    <w:abstractNumId w:val="7"/>
+    <w:abstractNumId w:val="11"/>
   </w:num>
   <w:num w:numId="6">
     <w:abstractNumId w:val="4"/>
   </w:num>
   <w:num w:numId="7">
-    <w:abstractNumId w:val="15"/>
+    <w:abstractNumId w:val="19"/>
   </w:num>
   <w:num w:numId="8">
-    <w:abstractNumId w:val="8"/>
+    <w:abstractNumId w:val="12"/>
   </w:num>
   <w:num w:numId="9">
     <w:abstractNumId w:val="0"/>
@@ -7501,28 +8757,43 @@
     <w:abstractNumId w:val="5"/>
   </w:num>
   <w:num w:numId="11">
-    <w:abstractNumId w:val="6"/>
+    <w:abstractNumId w:val="10"/>
   </w:num>
   <w:num w:numId="12">
     <w:abstractNumId w:val="2"/>
   </w:num>
   <w:num w:numId="13">
-    <w:abstractNumId w:val="9"/>
+    <w:abstractNumId w:val="13"/>
   </w:num>
   <w:num w:numId="14">
-    <w:abstractNumId w:val="16"/>
+    <w:abstractNumId w:val="20"/>
   </w:num>
   <w:num w:numId="15">
-    <w:abstractNumId w:val="13"/>
+    <w:abstractNumId w:val="17"/>
   </w:num>
   <w:num w:numId="16">
-    <w:abstractNumId w:val="11"/>
+    <w:abstractNumId w:val="15"/>
   </w:num>
   <w:num w:numId="17">
     <w:abstractNumId w:val="3"/>
   </w:num>
   <w:num w:numId="18">
-    <w:abstractNumId w:val="14"/>
+    <w:abstractNumId w:val="18"/>
+  </w:num>
+  <w:num w:numId="19">
+    <w:abstractNumId w:val="7"/>
+  </w:num>
+  <w:num w:numId="20">
+    <w:abstractNumId w:val="9"/>
+  </w:num>
+  <w:num w:numId="21">
+    <w:abstractNumId w:val="6"/>
+  </w:num>
+  <w:num w:numId="22">
+    <w:abstractNumId w:val="21"/>
+  </w:num>
+  <w:num w:numId="23">
+    <w:abstractNumId w:val="8"/>
   </w:num>
 </w:numbering>
 </file>
@@ -8718,6 +9989,23 @@
       <w:lang w:val="en-US"/>
     </w:rPr>
   </w:style>
+  <w:style w:type="paragraph" w:styleId="NormalWeb">
+    <w:name w:val="Normal (Web)"/>
+    <w:basedOn w:val="Normal"/>
+    <w:uiPriority w:val="99"/>
+    <w:semiHidden/>
+    <w:unhideWhenUsed/>
+    <w:rsid w:val="003F2678"/>
+    <w:pPr>
+      <w:spacing w:before="100" w:beforeAutospacing="1" w:after="100" w:afterAutospacing="1" w:line="240" w:lineRule="auto"/>
+    </w:pPr>
+    <w:rPr>
+      <w:rFonts w:ascii="Times New Roman" w:eastAsia="Times New Roman" w:hAnsi="Times New Roman" w:cs="Times New Roman"/>
+      <w:sz w:val="24"/>
+      <w:szCs w:val="24"/>
+      <w:lang w:val="en-US"/>
+    </w:rPr>
+  </w:style>
 </w:styles>
 </file>
 

</xml_diff>